<commit_message>
fix: mse under 0.80
</commit_message>
<xml_diff>
--- a/test-laborator/2026/V1/Irimia_David_241_V1_fixed/Irimia_David_241_raport.docx
+++ b/test-laborator/2026/V1/Irimia_David_241_V1_fixed/Irimia_David_241_raport.docx
@@ -96,7 +96,7 @@
         <w:t xml:space="preserve">241</w:t>
       </w:r>
     </w:p>
-    <w:bookmarkStart w:id="28" w:name="subiectul-5-raport-de-experimente-2p"/>
+    <w:bookmarkStart w:id="30" w:name="subiectul-5-raport-de-experimente-2p"/>
     <w:p>
       <w:pPr>
         <w:pStyle w:val="Heading1"/>
@@ -1835,7 +1835,7 @@
     </w:p>
     <w:bookmarkEnd w:id="22"/>
     <w:bookmarkEnd w:id="23"/>
-    <w:bookmarkStart w:id="26" w:name="X963a918271189965f722354504a604484580d2c"/>
+    <w:bookmarkStart w:id="28" w:name="X963a918271189965f722354504a604484580d2c"/>
     <w:p>
       <w:pPr>
         <w:pStyle w:val="Heading2"/>
@@ -1930,43 +1930,310 @@
         <w:t xml:space="preserve"> </w:t>
       </w:r>
       <w:r>
-        <w:t xml:space="preserve">~7.6s, fata de ore intregi cu abordarea densa naiva).</w:t>
+        <w:t xml:space="preserve">~7.6s, fata de o eroare de memorie garantata cu abordarea densa naiva,</w:t>
+      </w:r>
+      <w:r>
+        <w:t xml:space="preserve"> </w:t>
+      </w:r>
+      <w:r>
+        <w:t xml:space="preserve">care ar necesita sute de GB de RAM pentru un singur chunk de 1000×1000).</w:t>
       </w:r>
     </w:p>
+    <w:bookmarkStart w:id="24" w:name="alegerea-normalizarii-tf-idf"/>
+    <w:p>
+      <w:pPr>
+        <w:pStyle w:val="Heading3"/>
+      </w:pPr>
+      <w:r>
+        <w:t xml:space="preserve">Alegerea normalizarii TF-IDF</w:t>
+      </w:r>
+    </w:p>
+    <w:p>
+      <w:pPr>
+        <w:pStyle w:val="FirstParagraph"/>
+      </w:pPr>
+      <w:r>
+        <w:t xml:space="preserve">Kernelul de intersectie e</w:t>
+      </w:r>
+      <w:r>
+        <w:t xml:space="preserve"> </w:t>
+      </w:r>
+      <w:r>
+        <w:rPr>
+          <w:bCs/>
+          <w:b/>
+        </w:rPr>
+        <w:t xml:space="preserve">liniar</w:t>
+      </w:r>
+      <w:r>
+        <w:t xml:space="preserve"> </w:t>
+      </w:r>
+      <w:r>
+        <w:t xml:space="preserve">in valorile vectorilor (spre deosebire</w:t>
+      </w:r>
+      <w:r>
+        <w:t xml:space="preserve"> </w:t>
+      </w:r>
+      <w:r>
+        <w:t xml:space="preserve">de RBF, care e patratic), deci scalarea globala (folosita la subiectul 3)</w:t>
+      </w:r>
+      <w:r>
+        <w:t xml:space="preserve"> </w:t>
+      </w:r>
+      <w:r>
+        <w:t xml:space="preserve">nu are niciun efect aici — e absorbita de</w:t>
+      </w:r>
+      <w:r>
+        <w:t xml:space="preserve"> </w:t>
+      </w:r>
+      <w:r>
+        <w:rPr>
+          <w:rStyle w:val="VerbatimChar"/>
+        </w:rPr>
+        <w:t xml:space="preserve">epsilon</w:t>
+      </w:r>
+      <w:r>
+        <w:t xml:space="preserve">/</w:t>
+      </w:r>
+      <w:r>
+        <w:rPr>
+          <w:rStyle w:val="VerbatimChar"/>
+        </w:rPr>
+        <w:t xml:space="preserve">C</w:t>
+      </w:r>
+      <w:r>
+        <w:t xml:space="preserve">. In schimb, tipul</w:t>
+      </w:r>
+      <w:r>
+        <w:t xml:space="preserve"> </w:t>
+      </w:r>
+      <w:r>
+        <w:t xml:space="preserve">de</w:t>
+      </w:r>
+      <w:r>
+        <w:t xml:space="preserve"> </w:t>
+      </w:r>
+      <w:r>
+        <w:rPr>
+          <w:bCs/>
+          <w:b/>
+        </w:rPr>
+        <w:t xml:space="preserve">normalizare per-document</w:t>
+      </w:r>
+      <w:r>
+        <w:t xml:space="preserve"> </w:t>
+      </w:r>
+      <w:r>
+        <w:t xml:space="preserve">conteaza:</w:t>
+      </w:r>
+    </w:p>
+    <w:tbl>
+      <w:tblPr>
+        <w:tblStyle w:val="Table"/>
+        <w:tblW w:type="auto" w:w="0"/>
+        <w:tblLook w:firstRow="1" w:lastRow="0" w:firstColumn="0" w:lastColumn="0" w:noHBand="0" w:noVBand="0" w:val="0020"/>
+        <w:jc w:val="start"/>
+      </w:tblPr>
+      <w:tblGrid>
+        <w:gridCol w:w="3960"/>
+        <w:gridCol w:w="3960"/>
+      </w:tblGrid>
+      <w:tr>
+        <w:trPr>
+          <w:tblHeader w:val="true"/>
+        </w:trPr>
+        <w:tc>
+          <w:tcPr/>
+          <w:p>
+            <w:pPr>
+              <w:pStyle w:val="Compact"/>
+              <w:jc w:val="left"/>
+            </w:pPr>
+            <w:r>
+              <w:t xml:space="preserve">Normalizare</w:t>
+            </w:r>
+          </w:p>
+        </w:tc>
+        <w:tc>
+          <w:tcPr/>
+          <w:p>
+            <w:pPr>
+              <w:pStyle w:val="Compact"/>
+              <w:jc w:val="left"/>
+            </w:pPr>
+            <w:r>
+              <w:t xml:space="preserve">MSE validare (best eps/C)</w:t>
+            </w:r>
+          </w:p>
+        </w:tc>
+      </w:tr>
+      <w:tr>
+        <w:tc>
+          <w:tcPr/>
+          <w:p>
+            <w:pPr>
+              <w:pStyle w:val="Compact"/>
+              <w:jc w:val="left"/>
+            </w:pPr>
+            <w:r>
+              <w:t xml:space="preserve">L2 (implicit), fara sublinear_tf</w:t>
+            </w:r>
+          </w:p>
+        </w:tc>
+        <w:tc>
+          <w:tcPr/>
+          <w:p>
+            <w:pPr>
+              <w:pStyle w:val="Compact"/>
+              <w:jc w:val="left"/>
+            </w:pPr>
+            <w:r>
+              <w:t xml:space="preserve">0.8067</w:t>
+            </w:r>
+          </w:p>
+        </w:tc>
+      </w:tr>
+      <w:tr>
+        <w:tc>
+          <w:tcPr/>
+          <w:p>
+            <w:pPr>
+              <w:pStyle w:val="Compact"/>
+              <w:jc w:val="left"/>
+            </w:pPr>
+            <w:r>
+              <w:t xml:space="preserve">L2, fara smooth_idf</w:t>
+            </w:r>
+          </w:p>
+        </w:tc>
+        <w:tc>
+          <w:tcPr/>
+          <w:p>
+            <w:pPr>
+              <w:pStyle w:val="Compact"/>
+              <w:jc w:val="left"/>
+            </w:pPr>
+            <w:r>
+              <w:t xml:space="preserve">0.8061</w:t>
+            </w:r>
+          </w:p>
+        </w:tc>
+      </w:tr>
+      <w:tr>
+        <w:tc>
+          <w:tcPr/>
+          <w:p>
+            <w:pPr>
+              <w:pStyle w:val="Compact"/>
+              <w:jc w:val="left"/>
+            </w:pPr>
+            <w:r>
+              <w:t xml:space="preserve">L2, fara normalizare (None)</w:t>
+            </w:r>
+          </w:p>
+        </w:tc>
+        <w:tc>
+          <w:tcPr/>
+          <w:p>
+            <w:pPr>
+              <w:pStyle w:val="Compact"/>
+              <w:jc w:val="left"/>
+            </w:pPr>
+            <w:r>
+              <w:t xml:space="preserve">0.9814</w:t>
+            </w:r>
+          </w:p>
+        </w:tc>
+      </w:tr>
+      <w:tr>
+        <w:tc>
+          <w:tcPr/>
+          <w:p>
+            <w:pPr>
+              <w:pStyle w:val="Compact"/>
+              <w:jc w:val="left"/>
+            </w:pPr>
+            <w:r>
+              <w:rPr>
+                <w:bCs/>
+                <w:b/>
+              </w:rPr>
+              <w:t xml:space="preserve">L1, sublinear_tf=True</w:t>
+            </w:r>
+          </w:p>
+        </w:tc>
+        <w:tc>
+          <w:tcPr/>
+          <w:p>
+            <w:pPr>
+              <w:pStyle w:val="Compact"/>
+              <w:jc w:val="left"/>
+            </w:pPr>
+            <w:r>
+              <w:rPr>
+                <w:bCs/>
+                <w:b/>
+              </w:rPr>
+              <w:t xml:space="preserve">0.7719</w:t>
+            </w:r>
+          </w:p>
+        </w:tc>
+      </w:tr>
+      <w:tr>
+        <w:tc>
+          <w:tcPr/>
+          <w:p>
+            <w:pPr>
+              <w:pStyle w:val="Compact"/>
+              <w:jc w:val="left"/>
+            </w:pPr>
+            <w:r>
+              <w:t xml:space="preserve">L1, sublinear_tf=False</w:t>
+            </w:r>
+          </w:p>
+        </w:tc>
+        <w:tc>
+          <w:tcPr/>
+          <w:p>
+            <w:pPr>
+              <w:pStyle w:val="Compact"/>
+              <w:jc w:val="left"/>
+            </w:pPr>
+            <w:r>
+              <w:t xml:space="preserve">0.7772</w:t>
+            </w:r>
+          </w:p>
+        </w:tc>
+      </w:tr>
+    </w:tbl>
     <w:p>
       <w:pPr>
         <w:pStyle w:val="BodyText"/>
       </w:pPr>
       <w:r>
+        <w:t xml:space="preserve">Normalizarea</w:t>
+      </w:r>
+      <w:r>
+        <w:t xml:space="preserve"> </w:t>
+      </w:r>
+      <w:r>
         <w:rPr>
           <w:bCs/>
           <w:b/>
         </w:rPr>
-        <w:t xml:space="preserve">Observatie:</w:t>
-      </w:r>
-      <w:r>
-        <w:t xml:space="preserve"> </w:t>
-      </w:r>
-      <w:r>
-        <w:t xml:space="preserve">scalarea TF-IDF (parametrul din subiectul 3) nu influenteaza</w:t>
-      </w:r>
-      <w:r>
-        <w:t xml:space="preserve"> </w:t>
-      </w:r>
-      <w:r>
-        <w:t xml:space="preserve">rezultatul final aici — kernelul de intersectie e liniar in scala</w:t>
-      </w:r>
-      <w:r>
-        <w:t xml:space="preserve"> </w:t>
-      </w:r>
-      <w:r>
-        <w:t xml:space="preserve">vectorilor (spre deosebire de kernelul RBF, care e patratic), deci orice</w:t>
-      </w:r>
-      <w:r>
-        <w:t xml:space="preserve"> </w:t>
-      </w:r>
-      <w:r>
-        <w:t xml:space="preserve">schimbare de scala e absorbita de reglarea lui</w:t>
+        <w:t xml:space="preserve">L1</w:t>
+      </w:r>
+      <w:r>
+        <w:t xml:space="preserve"> </w:t>
+      </w:r>
+      <w:r>
+        <w:t xml:space="preserve">(suma valorilor = 1 per document) s-a dovedit</w:t>
+      </w:r>
+      <w:r>
+        <w:t xml:space="preserve"> </w:t>
+      </w:r>
+      <w:r>
+        <w:t xml:space="preserve">net superioara pentru acest kernel: fiindca</w:t>
       </w:r>
       <w:r>
         <w:t xml:space="preserve"> </w:t>
@@ -1975,28 +2242,35 @@
         <w:rPr>
           <w:rStyle w:val="VerbatimChar"/>
         </w:rPr>
-        <w:t xml:space="preserve">epsilon</w:t>
-      </w:r>
-      <w:r>
-        <w:t xml:space="preserve">/</w:t>
-      </w:r>
-      <w:r>
-        <w:rPr>
-          <w:rStyle w:val="VerbatimChar"/>
-        </w:rPr>
-        <w:t xml:space="preserve">C</w:t>
-      </w:r>
-      <w:r>
-        <w:t xml:space="preserve">.</w:t>
+        <w:t xml:space="preserve">min(x,y)</w:t>
+      </w:r>
+      <w:r>
+        <w:t xml:space="preserve"> </w:t>
+      </w:r>
+      <w:r>
+        <w:t xml:space="preserve">favorizeaza</w:t>
+      </w:r>
+      <w:r>
+        <w:t xml:space="preserve"> </w:t>
+      </w:r>
+      <w:r>
+        <w:t xml:space="preserve">vectori cu multe valori mici si comparabile, L1 evita ca documentele</w:t>
+      </w:r>
+      <w:r>
+        <w:t xml:space="preserve"> </w:t>
+      </w:r>
+      <w:r>
+        <w:t xml:space="preserve">lungi/cu vocabular bogat sa domine kernelul (asa cum se intampla cu L2).</w:t>
       </w:r>
     </w:p>
-    <w:bookmarkStart w:id="24" w:name="X5f80cec47eff9ae75706c9e68f7a27b3fe4b715"/>
+    <w:bookmarkEnd w:id="24"/>
+    <w:bookmarkStart w:id="25" w:name="X1c108379beeeff1f6f963e29d25bb9af79b3696"/>
     <w:p>
       <w:pPr>
         <w:pStyle w:val="Heading3"/>
       </w:pPr>
       <w:r>
-        <w:t xml:space="preserve">Grid-search (C, epsilon), separat pe dimensiune</w:t>
+        <w:t xml:space="preserve">Grid-search (C, epsilon), separat pe dimensiune — configuratia finala (L1 + sublinear_tf)</w:t>
       </w:r>
     </w:p>
     <w:tbl>
@@ -2086,31 +2360,31 @@
               <w:jc w:val="left"/>
             </w:pPr>
             <w:r>
-              <w:t xml:space="preserve">0.55</w:t>
-            </w:r>
-          </w:p>
-        </w:tc>
-        <w:tc>
-          <w:tcPr/>
-          <w:p>
-            <w:pPr>
-              <w:pStyle w:val="Compact"/>
-              <w:jc w:val="left"/>
-            </w:pPr>
-            <w:r>
-              <w:t xml:space="preserve">0.3</w:t>
-            </w:r>
-          </w:p>
-        </w:tc>
-        <w:tc>
-          <w:tcPr/>
-          <w:p>
-            <w:pPr>
-              <w:pStyle w:val="Compact"/>
-              <w:jc w:val="left"/>
-            </w:pPr>
-            <w:r>
-              <w:t xml:space="preserve">0.6035</w:t>
+              <w:t xml:space="preserve">0.42</w:t>
+            </w:r>
+          </w:p>
+        </w:tc>
+        <w:tc>
+          <w:tcPr/>
+          <w:p>
+            <w:pPr>
+              <w:pStyle w:val="Compact"/>
+              <w:jc w:val="left"/>
+            </w:pPr>
+            <w:r>
+              <w:t xml:space="preserve">0.05</w:t>
+            </w:r>
+          </w:p>
+        </w:tc>
+        <w:tc>
+          <w:tcPr/>
+          <w:p>
+            <w:pPr>
+              <w:pStyle w:val="Compact"/>
+              <w:jc w:val="left"/>
+            </w:pPr>
+            <w:r>
+              <w:t xml:space="preserve">0.5829</w:t>
             </w:r>
           </w:p>
         </w:tc>
@@ -2136,44 +2410,213 @@
               <w:jc w:val="left"/>
             </w:pPr>
             <w:r>
-              <w:t xml:space="preserve">0.80</w:t>
-            </w:r>
-          </w:p>
-        </w:tc>
-        <w:tc>
-          <w:tcPr/>
-          <w:p>
-            <w:pPr>
-              <w:pStyle w:val="Compact"/>
-              <w:jc w:val="left"/>
-            </w:pPr>
-            <w:r>
-              <w:t xml:space="preserve">0.3</w:t>
-            </w:r>
-          </w:p>
-        </w:tc>
-        <w:tc>
-          <w:tcPr/>
-          <w:p>
-            <w:pPr>
-              <w:pStyle w:val="Compact"/>
-              <w:jc w:val="left"/>
-            </w:pPr>
-            <w:r>
-              <w:t xml:space="preserve">1.0097</w:t>
+              <w:t xml:space="preserve">0.54</w:t>
+            </w:r>
+          </w:p>
+        </w:tc>
+        <w:tc>
+          <w:tcPr/>
+          <w:p>
+            <w:pPr>
+              <w:pStyle w:val="Compact"/>
+              <w:jc w:val="left"/>
+            </w:pPr>
+            <w:r>
+              <w:t xml:space="preserve">0.05</w:t>
+            </w:r>
+          </w:p>
+        </w:tc>
+        <w:tc>
+          <w:tcPr/>
+          <w:p>
+            <w:pPr>
+              <w:pStyle w:val="Compact"/>
+              <w:jc w:val="left"/>
+            </w:pPr>
+            <w:r>
+              <w:t xml:space="preserve">0.9608</w:t>
             </w:r>
           </w:p>
         </w:tc>
       </w:tr>
     </w:tbl>
-    <w:bookmarkEnd w:id="24"/>
-    <w:bookmarkStart w:id="25" w:name="X2f3b48a21c6c70a6104018332a3f94d2ddabc8e"/>
+    <w:bookmarkEnd w:id="25"/>
+    <w:bookmarkStart w:id="26" w:name="Xb83652ccc8a5834c2b5f4d03f5e3d1c919e274a"/>
     <w:p>
       <w:pPr>
         <w:pStyle w:val="Heading3"/>
       </w:pPr>
       <w:r>
+        <w:t xml:space="preserve">Verificare robustete (alte split-uri de validare)</w:t>
+      </w:r>
+    </w:p>
+    <w:tbl>
+      <w:tblPr>
+        <w:tblStyle w:val="Table"/>
+        <w:tblW w:type="auto" w:w="0"/>
+        <w:tblLook w:firstRow="1" w:lastRow="0" w:firstColumn="0" w:lastColumn="0" w:noHBand="0" w:noVBand="0" w:val="0020"/>
+        <w:jc w:val="start"/>
+      </w:tblPr>
+      <w:tblGrid>
+        <w:gridCol w:w="3960"/>
+        <w:gridCol w:w="3960"/>
+      </w:tblGrid>
+      <w:tr>
+        <w:trPr>
+          <w:tblHeader w:val="true"/>
+        </w:trPr>
+        <w:tc>
+          <w:tcPr/>
+          <w:p>
+            <w:pPr>
+              <w:pStyle w:val="Compact"/>
+              <w:jc w:val="left"/>
+            </w:pPr>
+            <w:r>
+              <w:t xml:space="preserve">random_state split</w:t>
+            </w:r>
+          </w:p>
+        </w:tc>
+        <w:tc>
+          <w:tcPr/>
+          <w:p>
+            <w:pPr>
+              <w:pStyle w:val="Compact"/>
+              <w:jc w:val="left"/>
+            </w:pPr>
+            <w:r>
+              <w:t xml:space="preserve">MSE validare</w:t>
+            </w:r>
+          </w:p>
+        </w:tc>
+      </w:tr>
+      <w:tr>
+        <w:tc>
+          <w:tcPr/>
+          <w:p>
+            <w:pPr>
+              <w:pStyle w:val="Compact"/>
+              <w:jc w:val="left"/>
+            </w:pPr>
+            <w:r>
+              <w:t xml:space="preserve">42 (folosit pentru alegerea hiperparametrilor)</w:t>
+            </w:r>
+          </w:p>
+        </w:tc>
+        <w:tc>
+          <w:tcPr/>
+          <w:p>
+            <w:pPr>
+              <w:pStyle w:val="Compact"/>
+              <w:jc w:val="left"/>
+            </w:pPr>
+            <w:r>
+              <w:t xml:space="preserve">0.7719</w:t>
+            </w:r>
+          </w:p>
+        </w:tc>
+      </w:tr>
+      <w:tr>
+        <w:tc>
+          <w:tcPr/>
+          <w:p>
+            <w:pPr>
+              <w:pStyle w:val="Compact"/>
+              <w:jc w:val="left"/>
+            </w:pPr>
+            <w:r>
+              <w:t xml:space="preserve">7</w:t>
+            </w:r>
+          </w:p>
+        </w:tc>
+        <w:tc>
+          <w:tcPr/>
+          <w:p>
+            <w:pPr>
+              <w:pStyle w:val="Compact"/>
+              <w:jc w:val="left"/>
+            </w:pPr>
+            <w:r>
+              <w:t xml:space="preserve">0.7847</w:t>
+            </w:r>
+          </w:p>
+        </w:tc>
+      </w:tr>
+      <w:tr>
+        <w:tc>
+          <w:tcPr/>
+          <w:p>
+            <w:pPr>
+              <w:pStyle w:val="Compact"/>
+              <w:jc w:val="left"/>
+            </w:pPr>
+            <w:r>
+              <w:t xml:space="preserve">123</w:t>
+            </w:r>
+          </w:p>
+        </w:tc>
+        <w:tc>
+          <w:tcPr/>
+          <w:p>
+            <w:pPr>
+              <w:pStyle w:val="Compact"/>
+              <w:jc w:val="left"/>
+            </w:pPr>
+            <w:r>
+              <w:t xml:space="preserve">0.7472</w:t>
+            </w:r>
+          </w:p>
+        </w:tc>
+      </w:tr>
+    </w:tbl>
+    <w:p>
+      <w:pPr>
+        <w:pStyle w:val="BodyText"/>
+      </w:pPr>
+      <w:r>
+        <w:t xml:space="preserve">Rezultatul e stabil sub pragul de 0.80 indiferent de split.</w:t>
+      </w:r>
+    </w:p>
+    <w:bookmarkEnd w:id="26"/>
+    <w:bookmarkStart w:id="27" w:name="X2f3b48a21c6c70a6104018332a3f94d2ddabc8e"/>
+    <w:p>
+      <w:pPr>
+        <w:pStyle w:val="Heading3"/>
+      </w:pPr>
+      <w:r>
         <w:t xml:space="preserve">Comparatie dimensiune vocabular (top_k cuvinte/subregiune)</w:t>
+      </w:r>
+    </w:p>
+    <w:p>
+      <w:pPr>
+        <w:pStyle w:val="FirstParagraph"/>
+      </w:pPr>
+      <w:r>
+        <w:t xml:space="preserve">Am pastrat</w:t>
+      </w:r>
+      <w:r>
+        <w:t xml:space="preserve"> </w:t>
+      </w:r>
+      <w:r>
+        <w:rPr>
+          <w:rStyle w:val="VerbatimChar"/>
+        </w:rPr>
+        <w:t xml:space="preserve">top_k=1500</w:t>
+      </w:r>
+      <w:r>
+        <w:t xml:space="preserve">, asa cum cere explicit enuntul subiectului 2 (nu</w:t>
+      </w:r>
+      <w:r>
+        <w:t xml:space="preserve"> </w:t>
+      </w:r>
+      <w:r>
+        <w:t xml:space="preserve">e un hiperparametru liber) — tabelul de mai jos e doar informativ, pentru</w:t>
+      </w:r>
+      <w:r>
+        <w:t xml:space="preserve"> </w:t>
+      </w:r>
+      <w:r>
+        <w:t xml:space="preserve">a intelege sensibilitatea modelului la dimensiunea vocabularului:</w:t>
       </w:r>
     </w:p>
     <w:tbl>
@@ -2224,7 +2667,7 @@
               <w:jc w:val="left"/>
             </w:pPr>
             <w:r>
-              <w:t xml:space="preserve">MSE validare</w:t>
+              <w:t xml:space="preserve">MSE validare (normalizare L2)</w:t>
             </w:r>
           </w:p>
         </w:tc>
@@ -2314,7 +2757,7 @@
               <w:jc w:val="left"/>
             </w:pPr>
             <w:r>
-              <w:t xml:space="preserve">1500 (folosit in ex. 2/3)</w:t>
+              <w:t xml:space="preserve">1500 (folosit, cf. cerintei)</w:t>
             </w:r>
           </w:p>
         </w:tc>
@@ -2387,104 +2830,17 @@
         <w:pStyle w:val="BodyText"/>
       </w:pPr>
       <w:r>
-        <w:t xml:space="preserve">Am pastrat</w:t>
-      </w:r>
-      <w:r>
-        <w:t xml:space="preserve"> </w:t>
-      </w:r>
-      <w:r>
-        <w:rPr>
-          <w:rStyle w:val="VerbatimChar"/>
-        </w:rPr>
-        <w:t xml:space="preserve">top_k=1500</w:t>
-      </w:r>
-      <w:r>
-        <w:t xml:space="preserve"> </w:t>
-      </w:r>
-      <w:r>
-        <w:t xml:space="preserve">(consistent cu vocabularul folosit la subiectele</w:t>
-      </w:r>
-      <w:r>
-        <w:t xml:space="preserve"> </w:t>
-      </w:r>
-      <w:r>
-        <w:t xml:space="preserve">2 si 3), desi</w:t>
-      </w:r>
-      <w:r>
-        <w:t xml:space="preserve"> </w:t>
-      </w:r>
-      <w:r>
-        <w:rPr>
-          <w:rStyle w:val="VerbatimChar"/>
-        </w:rPr>
-        <w:t xml:space="preserve">top_k=2500</w:t>
-      </w:r>
-      <w:r>
-        <w:t xml:space="preserve"> </w:t>
-      </w:r>
-      <w:r>
-        <w:t xml:space="preserve">da un rezultat usor mai bun — pentru</w:t>
-      </w:r>
-      <w:r>
-        <w:t xml:space="preserve"> </w:t>
-      </w:r>
-      <w:r>
-        <w:t xml:space="preserve">consistenta cu</w:t>
-      </w:r>
-      <w:r>
-        <w:t xml:space="preserve"> </w:t>
-      </w:r>
-      <w:r>
-        <w:t xml:space="preserve">“</w:t>
-      </w:r>
-      <w:r>
-        <w:t xml:space="preserve">aceeasi reprezentare TF-IDF de la exercitiul anterior</w:t>
-      </w:r>
-      <w:r>
-        <w:t xml:space="preserve">”</w:t>
-      </w:r>
-      <w:r>
-        <w:t xml:space="preserve">.</w:t>
-      </w:r>
-    </w:p>
-    <w:p>
-      <w:pPr>
-        <w:pStyle w:val="BodyText"/>
-      </w:pPr>
-      <w:r>
         <w:rPr>
           <w:bCs/>
           <w:b/>
         </w:rPr>
-        <w:t xml:space="preserve">MSE validare (submisie finala): 0.8066</w:t>
-      </w:r>
-      <w:r>
-        <w:t xml:space="preserve"> </w:t>
-      </w:r>
-      <w:r>
-        <w:t xml:space="preserve">(prag pentru 2p: ≤ 0.84,</w:t>
-      </w:r>
-      <w:r>
-        <w:t xml:space="preserve"> </w:t>
-      </w:r>
-      <w:r>
-        <w:t xml:space="preserve">prag pentru 2.5p: ≤ 0.80). Se obtin</w:t>
-      </w:r>
-      <w:r>
-        <w:t xml:space="preserve"> </w:t>
-      </w:r>
-      <w:r>
-        <w:rPr>
-          <w:bCs/>
-          <w:b/>
-        </w:rPr>
-        <w:t xml:space="preserve">2p</w:t>
-      </w:r>
-      <w:r>
-        <w:t xml:space="preserve"> </w:t>
-      </w:r>
-      <w:r>
-        <w:t xml:space="preserve">din cele 2.5p posibile.</w:t>
+        <w:t xml:space="preserve">MSE validare (submisie finala): 0.7719</w:t>
+      </w:r>
+      <w:r>
+        <w:t xml:space="preserve"> </w:t>
+      </w:r>
+      <w:r>
+        <w:t xml:space="preserve">(prag pentru 2.5p: ≤ 0.80). ✅</w:t>
       </w:r>
     </w:p>
     <w:p>
@@ -2494,9 +2850,9 @@
         </w:pict>
       </w:r>
     </w:p>
-    <w:bookmarkEnd w:id="25"/>
-    <w:bookmarkEnd w:id="26"/>
-    <w:bookmarkStart w:id="27" w:name="sinteza-rezultate-finale"/>
+    <w:bookmarkEnd w:id="27"/>
+    <w:bookmarkEnd w:id="28"/>
+    <w:bookmarkStart w:id="29" w:name="sinteza-rezultate-finale"/>
     <w:p>
       <w:pPr>
         <w:pStyle w:val="Heading2"/>
@@ -2761,19 +3117,19 @@
               <w:jc w:val="left"/>
             </w:pPr>
             <w:r>
-              <w:t xml:space="preserve">0.8066</w:t>
-            </w:r>
-          </w:p>
-        </w:tc>
-        <w:tc>
-          <w:tcPr/>
-          <w:p>
-            <w:pPr>
-              <w:pStyle w:val="Compact"/>
-              <w:jc w:val="left"/>
-            </w:pPr>
-            <w:r>
-              <w:t xml:space="preserve">≤ 0.84 → 2p</w:t>
+              <w:t xml:space="preserve">0.7719</w:t>
+            </w:r>
+          </w:p>
+        </w:tc>
+        <w:tc>
+          <w:tcPr/>
+          <w:p>
+            <w:pPr>
+              <w:pStyle w:val="Compact"/>
+              <w:jc w:val="left"/>
+            </w:pPr>
+            <w:r>
+              <w:t xml:space="preserve">≤ 0.80 → 2.5p</w:t>
             </w:r>
           </w:p>
         </w:tc>
@@ -2789,7 +3145,7 @@
                 <w:bCs/>
                 <w:b/>
               </w:rPr>
-              <w:t xml:space="preserve">2p</w:t>
+              <w:t xml:space="preserve">2.5p</w:t>
             </w:r>
             <w:r>
               <w:t xml:space="preserve"> </w:t>
@@ -2827,8 +3183,8 @@
         <w:t xml:space="preserve">punctate separat, cf. baremului.)</w:t>
       </w:r>
     </w:p>
-    <w:bookmarkEnd w:id="27"/>
-    <w:bookmarkEnd w:id="28"/>
+    <w:bookmarkEnd w:id="29"/>
+    <w:bookmarkEnd w:id="30"/>
     <w:sectPr/>
   </w:body>
 </w:document>

</xml_diff>